<commit_message>
Improve resume document layout engine
</commit_message>
<xml_diff>
--- a/examples/outputs/example-targeted-resume.docx
+++ b/examples/outputs/example-targeted-resume.docx
@@ -5,8 +5,10 @@
     <w:p>
       <w:pPr>
         <w:pStyle w:val="Title"/>
+        <w:widowControl/>
         <w:jc w:val="center"/>
-        <w:spacing w:after="80"/>
+        <w:keepLines/>
+        <w:spacing w:after="70"/>
       </w:pPr>
       <w:r>
         <w:t xml:space="preserve">Alex Chen</w:t>
@@ -14,8 +16,10 @@
     </w:p>
     <w:p>
       <w:pPr>
+        <w:widowControl/>
         <w:jc w:val="center"/>
-        <w:spacing w:after="80"/>
+        <w:keepLines/>
+        <w:spacing w:after="70"/>
       </w:pPr>
       <w:r>
         <w:t xml:space="preserve">alex.chen@example.com | New York, NY | linkedin.com/in/alexchen | github.com/alexchen</w:t>
@@ -24,10 +28,13 @@
     <w:p>
       <w:pPr>
         <w:pStyle w:val="Heading2"/>
+        <w:widowControl/>
         <w:pBdr>
           <w:bottom w:val="single" w:sz="8" w:space="3" w:color="222222"/>
         </w:pBdr>
         <w:keepNext/>
+        <w:keepLines/>
+        <w:spacing w:before="140" w:after="70"/>
       </w:pPr>
       <w:r>
         <w:t xml:space="preserve">Education</w:t>
@@ -36,7 +43,9 @@
     <w:p>
       <w:pPr>
         <w:pStyle w:val="Heading3"/>
-        <w:keepNext/>
+        <w:widowControl/>
+        <w:keepNext/>
+        <w:keepLines/>
       </w:pPr>
       <w:r>
         <w:t xml:space="preserve">Columbia University</w:t>
@@ -44,6 +53,7 @@
     </w:p>
     <w:p>
       <w:pPr>
+        <w:widowControl/>
         <w:spacing w:after="70" w:line="250" w:lineRule="auto"/>
       </w:pPr>
       <w:r>
@@ -52,7 +62,8 @@
     </w:p>
     <w:p>
       <w:pPr>
-        <w:spacing w:after="35" w:line="245" w:lineRule="auto"/>
+        <w:widowControl/>
+        <w:spacing w:after="35" w:line="250" w:lineRule="auto"/>
         <w:numPr>
           <w:ilvl w:val="0"/>
           <w:numId w:val="1"/>
@@ -65,7 +76,9 @@
     <w:p>
       <w:pPr>
         <w:pStyle w:val="Heading3"/>
-        <w:keepNext/>
+        <w:widowControl/>
+        <w:keepNext/>
+        <w:keepLines/>
       </w:pPr>
       <w:r>
         <w:t xml:space="preserve">University of Illinois Urbana-Champaign</w:t>
@@ -73,6 +86,7 @@
     </w:p>
     <w:p>
       <w:pPr>
+        <w:widowControl/>
         <w:spacing w:after="70" w:line="250" w:lineRule="auto"/>
       </w:pPr>
       <w:r>
@@ -81,7 +95,8 @@
     </w:p>
     <w:p>
       <w:pPr>
-        <w:spacing w:after="35" w:line="245" w:lineRule="auto"/>
+        <w:widowControl/>
+        <w:spacing w:after="35" w:line="250" w:lineRule="auto"/>
         <w:numPr>
           <w:ilvl w:val="0"/>
           <w:numId w:val="1"/>
@@ -94,10 +109,13 @@
     <w:p>
       <w:pPr>
         <w:pStyle w:val="Heading2"/>
+        <w:widowControl/>
         <w:pBdr>
           <w:bottom w:val="single" w:sz="8" w:space="3" w:color="222222"/>
         </w:pBdr>
         <w:keepNext/>
+        <w:keepLines/>
+        <w:spacing w:before="140" w:after="70"/>
       </w:pPr>
       <w:r>
         <w:t xml:space="preserve">Technical Skills</w:t>
@@ -105,7 +123,8 @@
     </w:p>
     <w:p>
       <w:pPr>
-        <w:spacing w:after="35" w:line="245" w:lineRule="auto"/>
+        <w:widowControl/>
+        <w:spacing w:after="35" w:line="250" w:lineRule="auto"/>
         <w:numPr>
           <w:ilvl w:val="0"/>
           <w:numId w:val="1"/>
@@ -117,7 +136,8 @@
     </w:p>
     <w:p>
       <w:pPr>
-        <w:spacing w:after="35" w:line="245" w:lineRule="auto"/>
+        <w:widowControl/>
+        <w:spacing w:after="35" w:line="250" w:lineRule="auto"/>
         <w:numPr>
           <w:ilvl w:val="0"/>
           <w:numId w:val="1"/>
@@ -129,7 +149,8 @@
     </w:p>
     <w:p>
       <w:pPr>
-        <w:spacing w:after="35" w:line="245" w:lineRule="auto"/>
+        <w:widowControl/>
+        <w:spacing w:after="35" w:line="250" w:lineRule="auto"/>
         <w:numPr>
           <w:ilvl w:val="0"/>
           <w:numId w:val="1"/>
@@ -142,10 +163,13 @@
     <w:p>
       <w:pPr>
         <w:pStyle w:val="Heading2"/>
+        <w:widowControl/>
         <w:pBdr>
           <w:bottom w:val="single" w:sz="8" w:space="3" w:color="222222"/>
         </w:pBdr>
         <w:keepNext/>
+        <w:keepLines/>
+        <w:spacing w:before="140" w:after="70"/>
       </w:pPr>
       <w:r>
         <w:t xml:space="preserve">Experience</w:t>
@@ -154,7 +178,9 @@
     <w:p>
       <w:pPr>
         <w:pStyle w:val="Heading3"/>
-        <w:keepNext/>
+        <w:widowControl/>
+        <w:keepNext/>
+        <w:keepLines/>
       </w:pPr>
       <w:r>
         <w:t xml:space="preserve">Data Platform Intern, FinSight Analytics</w:t>
@@ -162,6 +188,7 @@
     </w:p>
     <w:p>
       <w:pPr>
+        <w:widowControl/>
         <w:spacing w:after="70" w:line="250" w:lineRule="auto"/>
       </w:pPr>
       <w:r>
@@ -170,7 +197,8 @@
     </w:p>
     <w:p>
       <w:pPr>
-        <w:spacing w:after="35" w:line="245" w:lineRule="auto"/>
+        <w:widowControl/>
+        <w:spacing w:after="35" w:line="250" w:lineRule="auto"/>
         <w:numPr>
           <w:ilvl w:val="0"/>
           <w:numId w:val="1"/>
@@ -182,7 +210,8 @@
     </w:p>
     <w:p>
       <w:pPr>
-        <w:spacing w:after="35" w:line="245" w:lineRule="auto"/>
+        <w:widowControl/>
+        <w:spacing w:after="35" w:line="250" w:lineRule="auto"/>
         <w:numPr>
           <w:ilvl w:val="0"/>
           <w:numId w:val="1"/>
@@ -194,7 +223,8 @@
     </w:p>
     <w:p>
       <w:pPr>
-        <w:spacing w:after="35" w:line="245" w:lineRule="auto"/>
+        <w:widowControl/>
+        <w:spacing w:after="35" w:line="250" w:lineRule="auto"/>
         <w:numPr>
           <w:ilvl w:val="0"/>
           <w:numId w:val="1"/>
@@ -207,7 +237,9 @@
     <w:p>
       <w:pPr>
         <w:pStyle w:val="Heading3"/>
-        <w:keepNext/>
+        <w:widowControl/>
+        <w:keepNext/>
+        <w:keepLines/>
       </w:pPr>
       <w:r>
         <w:t xml:space="preserve">Software Engineering Project, Campus Course Planner</w:t>
@@ -215,6 +247,7 @@
     </w:p>
     <w:p>
       <w:pPr>
+        <w:widowControl/>
         <w:spacing w:after="70" w:line="250" w:lineRule="auto"/>
       </w:pPr>
       <w:r>
@@ -223,7 +256,8 @@
     </w:p>
     <w:p>
       <w:pPr>
-        <w:spacing w:after="35" w:line="245" w:lineRule="auto"/>
+        <w:widowControl/>
+        <w:spacing w:after="35" w:line="250" w:lineRule="auto"/>
         <w:numPr>
           <w:ilvl w:val="0"/>
           <w:numId w:val="1"/>
@@ -235,7 +269,8 @@
     </w:p>
     <w:p>
       <w:pPr>
-        <w:spacing w:after="35" w:line="245" w:lineRule="auto"/>
+        <w:widowControl/>
+        <w:spacing w:after="35" w:line="250" w:lineRule="auto"/>
         <w:numPr>
           <w:ilvl w:val="0"/>
           <w:numId w:val="1"/>
@@ -247,7 +282,8 @@
     </w:p>
     <w:p>
       <w:pPr>
-        <w:spacing w:after="35" w:line="245" w:lineRule="auto"/>
+        <w:widowControl/>
+        <w:spacing w:after="35" w:line="250" w:lineRule="auto"/>
         <w:numPr>
           <w:ilvl w:val="0"/>
           <w:numId w:val="1"/>
@@ -260,10 +296,13 @@
     <w:p>
       <w:pPr>
         <w:pStyle w:val="Heading2"/>
+        <w:widowControl/>
         <w:pBdr>
           <w:bottom w:val="single" w:sz="8" w:space="3" w:color="222222"/>
         </w:pBdr>
         <w:keepNext/>
+        <w:keepLines/>
+        <w:spacing w:before="140" w:after="70"/>
       </w:pPr>
       <w:r>
         <w:t xml:space="preserve">Projects</w:t>
@@ -272,7 +311,9 @@
     <w:p>
       <w:pPr>
         <w:pStyle w:val="Heading3"/>
-        <w:keepNext/>
+        <w:widowControl/>
+        <w:keepNext/>
+        <w:keepLines/>
       </w:pPr>
       <w:r>
         <w:t xml:space="preserve">Recommendation System Prototype</w:t>
@@ -280,7 +321,8 @@
     </w:p>
     <w:p>
       <w:pPr>
-        <w:spacing w:after="35" w:line="245" w:lineRule="auto"/>
+        <w:widowControl/>
+        <w:spacing w:after="35" w:line="250" w:lineRule="auto"/>
         <w:numPr>
           <w:ilvl w:val="0"/>
           <w:numId w:val="1"/>
@@ -292,7 +334,8 @@
     </w:p>
     <w:p>
       <w:pPr>
-        <w:spacing w:after="35" w:line="245" w:lineRule="auto"/>
+        <w:widowControl/>
+        <w:spacing w:after="35" w:line="250" w:lineRule="auto"/>
         <w:numPr>
           <w:ilvl w:val="0"/>
           <w:numId w:val="1"/>
@@ -333,6 +376,10 @@
 <w:styles xmlns:w="http://schemas.openxmlformats.org/wordprocessingml/2006/main">
   <w:style w:type="paragraph" w:default="1" w:styleId="Normal">
     <w:name w:val="Normal"/>
+    <w:pPr>
+      <w:widowControl/>
+      <w:spacing w:line="250" w:lineRule="auto"/>
+    </w:pPr>
     <w:rPr>
       <w:rFonts w:ascii="Arial" w:hAnsi="Arial"/>
       <w:sz w:val="21"/>
@@ -343,7 +390,8 @@
     <w:basedOn w:val="Normal"/>
     <w:pPr>
       <w:jc w:val="center"/>
-      <w:spacing w:after="120"/>
+      <w:keepLines/>
+      <w:spacing w:after="80"/>
     </w:pPr>
     <w:rPr>
       <w:b/>
@@ -354,7 +402,9 @@
     <w:name w:val="heading 2"/>
     <w:basedOn w:val="Normal"/>
     <w:pPr>
-      <w:spacing w:before="180" w:after="80"/>
+      <w:keepNext/>
+      <w:keepLines/>
+      <w:spacing w:before="140" w:after="70"/>
     </w:pPr>
     <w:rPr>
       <w:b/>
@@ -366,7 +416,9 @@
     <w:name w:val="heading 3"/>
     <w:basedOn w:val="Normal"/>
     <w:pPr>
-      <w:spacing w:before="120" w:after="40"/>
+      <w:keepNext/>
+      <w:keepLines/>
+      <w:spacing w:before="70" w:after="35"/>
     </w:pPr>
     <w:rPr>
       <w:b/>

</xml_diff>

<commit_message>
Add route-aware document templates
</commit_message>
<xml_diff>
--- a/examples/outputs/example-targeted-resume.docx
+++ b/examples/outputs/example-targeted-resume.docx
@@ -37,7 +37,7 @@
         <w:spacing w:before="140" w:after="70"/>
       </w:pPr>
       <w:r>
-        <w:t xml:space="preserve">Education</w:t>
+        <w:t xml:space="preserve">EDUCATION</w:t>
       </w:r>
     </w:p>
     <w:p>
@@ -118,7 +118,7 @@
         <w:spacing w:before="140" w:after="70"/>
       </w:pPr>
       <w:r>
-        <w:t xml:space="preserve">Technical Skills</w:t>
+        <w:t xml:space="preserve">TECHNICAL SKILLS</w:t>
       </w:r>
     </w:p>
     <w:p>
@@ -172,7 +172,7 @@
         <w:spacing w:before="140" w:after="70"/>
       </w:pPr>
       <w:r>
-        <w:t xml:space="preserve">Experience</w:t>
+        <w:t xml:space="preserve">EXPERIENCE</w:t>
       </w:r>
     </w:p>
     <w:p>
@@ -305,7 +305,7 @@
         <w:spacing w:before="140" w:after="70"/>
       </w:pPr>
       <w:r>
-        <w:t xml:space="preserve">Projects</w:t>
+        <w:t xml:space="preserve">PROJECTS</w:t>
       </w:r>
     </w:p>
     <w:p>
@@ -381,7 +381,7 @@
       <w:spacing w:line="250" w:lineRule="auto"/>
     </w:pPr>
     <w:rPr>
-      <w:rFonts w:ascii="Arial" w:hAnsi="Arial"/>
+      <w:rFonts w:ascii="Arial" w:hAnsi="Arial" w:eastAsia="Microsoft YaHei"/>
       <w:sz w:val="21"/>
     </w:rPr>
   </w:style>
@@ -394,6 +394,7 @@
       <w:spacing w:after="80"/>
     </w:pPr>
     <w:rPr>
+      <w:rFonts w:ascii="Arial" w:hAnsi="Arial" w:eastAsia="Microsoft YaHei"/>
       <w:b/>
       <w:sz w:val="36"/>
     </w:rPr>
@@ -407,6 +408,7 @@
       <w:spacing w:before="140" w:after="70"/>
     </w:pPr>
     <w:rPr>
+      <w:rFonts w:ascii="Arial" w:hAnsi="Arial" w:eastAsia="Microsoft YaHei"/>
       <w:b/>
       <w:sz w:val="24"/>
       <w:caps/>
@@ -421,6 +423,7 @@
       <w:spacing w:before="70" w:after="35"/>
     </w:pPr>
     <w:rPr>
+      <w:rFonts w:ascii="Arial" w:hAnsi="Arial" w:eastAsia="Microsoft YaHei"/>
       <w:b/>
       <w:sz w:val="22"/>
     </w:rPr>

</xml_diff>